<commit_message>
Add leakage audit to pipeline section
</commit_message>
<xml_diff>
--- a/AI_for_Medicine_Project_Report_Sergio_FINAL_CLEAN.docx
+++ b/AI_for_Medicine_Project_Report_Sergio_FINAL_CLEAN.docx
@@ -1626,13 +1626,13 @@
     </w:p>
     <w:p>
       <w:pPr>
-        <w:spacing w:after="160" w:before="40" w:line="259" w:lineRule="auto"/>
+        <w:spacing w:after="120" w:before="40" w:line="259" w:lineRule="auto"/>
         <w:jc w:val="center"/>
       </w:pPr>
       <w:r>
         <w:rPr>
           <w:i/>
-          <w:sz w:val="16"/>
+          <w:sz w:val="22"/>
         </w:rPr>
         <w:t>Figure 1. Correlation heatmap with annotated values.</w:t>
       </w:r>
@@ -1724,55 +1724,51 @@
         <w:rPr>
           <w:sz w:val="22"/>
         </w:rPr>
-        <w:t>Avoiding data leakage is one of the most important methodological parts of this project. Data leakage happens when information from validation or test data influences training. This can make the model appear better than it really is.</w:t>
+        <w:t>Avoiding data leakage is one of the most important methodological parts of this project. Data leakage happens when a spurious relationship between the input variables and the outcome is introduced during data collection, sampling or processing. This can produce inflated and falsely optimistic model performance.</w:t>
       </w:r>
     </w:p>
     <w:p>
       <w:pPr>
-        <w:spacing w:after="120" w:before="0" w:line="259" w:lineRule="auto"/>
-        <w:jc w:val="both"/>
+        <w:spacing w:after="120"/>
       </w:pPr>
       <w:r>
         <w:rPr>
           <w:sz w:val="22"/>
         </w:rPr>
-        <w:t>First, a stratified locked test set is created before model selection. This test set is not used to choose the best model, tune hyperparameters, define clinical stages, or inspect thresholds. It is used only at the end for final evaluation.</w:t>
+        <w:t>Following the leakage taxonomy discussed in the course, the first family is L1 leakage: lack of clean separation between training and test data. This project addresses it by creating a locked stratified test set before model selection. It also avoids preprocessing on the full dataset: imputation, scaling and one-hot encoding are placed inside the scikit-learn Pipeline, so they are fitted only on the training folds. Feature groups are clinically defined before modelling, and duplicated rows were checked before the split.</w:t>
       </w:r>
     </w:p>
     <w:p>
       <w:pPr>
-        <w:spacing w:after="120" w:before="0" w:line="259" w:lineRule="auto"/>
-        <w:jc w:val="both"/>
+        <w:spacing w:after="120"/>
       </w:pPr>
       <w:r>
         <w:rPr>
           <w:sz w:val="22"/>
         </w:rPr>
-        <w:t>Second, preprocessing leakage is avoided by using scikit-learn Pipeline and ColumnTransformer. Imputation, scaling, and one-hot encoding are fitted only on the training folds during cross-validation. The validation fold is transformed using parameters learned from the corresponding training data.</w:t>
+        <w:t>The second family is L2 leakage: illegitimate features. This means using variables that would not be available at prediction time or that indirectly reveal the outcome. To reduce this risk, variables are organised into clinical stages according to when they could plausibly become available. Stage 4 variables such as ca and thal are interpreted as advanced diagnostic information, not as early-screening variables.</w:t>
       </w:r>
     </w:p>
     <w:p>
       <w:pPr>
-        <w:spacing w:after="120" w:before="0" w:line="259" w:lineRule="auto"/>
-        <w:jc w:val="both"/>
+        <w:spacing w:after="120"/>
       </w:pPr>
       <w:r>
         <w:rPr>
           <w:sz w:val="22"/>
         </w:rPr>
-        <w:t>Third, hyperparameter leakage is avoided with nested cross-validation. The inner loop tunes hyperparameters with GridSearchCV, while the outer loop estimates performance. This is important because using the same validation data for both tuning and final estimation can produce optimistic results.</w:t>
+        <w:t>The third family is L3 leakage: the test set does not represent the distribution of interest or is not independent. In this dataset, each row represents one patient, so the split is performed at patient level. There are no multiple images or slices from the same patient that could appear on both sides of the split. The main remaining limitation is not leakage but external validity: the Cleveland dataset is small, old and from a specific clinical cohort.</w:t>
       </w:r>
     </w:p>
     <w:p>
       <w:pPr>
-        <w:spacing w:after="120" w:before="0" w:line="259" w:lineRule="auto"/>
-        <w:jc w:val="both"/>
+        <w:spacing w:after="120"/>
       </w:pPr>
       <w:r>
         <w:rPr>
           <w:sz w:val="22"/>
         </w:rPr>
-        <w:t>Fourth, threshold leakage is avoided by selecting thresholds using development data, not by optimising the final test set. This is especially important because threshold choice changes sensitivity, specificity, precision, and the confusion matrix.</w:t>
+        <w:t>Finally, nested cross-validation is used inside the development set. The inner loop tunes hyperparameters with GridSearchCV, while the outer loop estimates performance. Thresholds are also inspected using development data, not by optimising the locked test set. The pipeline mainly protects against L1 preprocessing leakage, while L2 and L3 are addressed by clinical feature design, patient-level splitting and cautious interpretation.</w:t>
       </w:r>
     </w:p>
     <w:p>
@@ -2666,13 +2662,13 @@
     </w:p>
     <w:p>
       <w:pPr>
-        <w:spacing w:after="160" w:before="40" w:line="259" w:lineRule="auto"/>
+        <w:spacing w:after="120" w:before="40" w:line="259" w:lineRule="auto"/>
         <w:jc w:val="center"/>
       </w:pPr>
       <w:r>
         <w:rPr>
           <w:i/>
-          <w:sz w:val="16"/>
+          <w:sz w:val="22"/>
         </w:rPr>
         <w:t>Figure 2. Nested CV ROC-AUC distribution by clinical stage and model.</w:t>
       </w:r>
@@ -3352,13 +3348,13 @@
     </w:p>
     <w:p>
       <w:pPr>
-        <w:spacing w:after="160" w:before="40" w:line="259" w:lineRule="auto"/>
+        <w:spacing w:after="120" w:before="40" w:line="259" w:lineRule="auto"/>
         <w:jc w:val="center"/>
       </w:pPr>
       <w:r>
         <w:rPr>
           <w:i/>
-          <w:sz w:val="16"/>
+          <w:sz w:val="22"/>
         </w:rPr>
         <w:t>Figure 3. Final test ROC curves by clinical stage.</w:t>
       </w:r>
@@ -3408,13 +3404,13 @@
     </w:p>
     <w:p>
       <w:pPr>
-        <w:spacing w:after="160" w:before="40" w:line="259" w:lineRule="auto"/>
+        <w:spacing w:after="120" w:before="40" w:line="259" w:lineRule="auto"/>
         <w:jc w:val="center"/>
       </w:pPr>
       <w:r>
         <w:rPr>
           <w:i/>
-          <w:sz w:val="16"/>
+          <w:sz w:val="22"/>
         </w:rPr>
         <w:t>Figure 4. Final test confusion matrices by clinical stage.</w:t>
       </w:r>
@@ -3476,13 +3472,13 @@
     </w:p>
     <w:p>
       <w:pPr>
-        <w:spacing w:after="160" w:before="40" w:line="259" w:lineRule="auto"/>
+        <w:spacing w:after="120" w:before="40" w:line="259" w:lineRule="auto"/>
         <w:jc w:val="center"/>
       </w:pPr>
       <w:r>
         <w:rPr>
           <w:i/>
-          <w:sz w:val="16"/>
+          <w:sz w:val="22"/>
         </w:rPr>
         <w:t>Figure 5. Final test threshold trade-off for the selected final strategy.</w:t>
       </w:r>
@@ -3544,13 +3540,13 @@
     </w:p>
     <w:p>
       <w:pPr>
-        <w:spacing w:after="160" w:before="40" w:line="259" w:lineRule="auto"/>
+        <w:spacing w:after="120" w:before="40" w:line="259" w:lineRule="auto"/>
         <w:jc w:val="center"/>
       </w:pPr>
       <w:r>
         <w:rPr>
           <w:i/>
-          <w:sz w:val="16"/>
+          <w:sz w:val="22"/>
         </w:rPr>
         <w:t>Figure 6. SHAP beeswarm plot for the final Logistic Regression model.</w:t>
       </w:r>
@@ -3699,6 +3695,9 @@
         <w:jc w:val="both"/>
       </w:pPr>
       <w:r>
+        <w:rPr>
+          <w:sz w:val="22"/>
+        </w:rPr>
         <w:t>The clearest limitation of this project is the small sample size. The dataset contains only 297 patients, and the locked test set contains 60 patients. For this reason, small differences between later stages should not be overinterpreted.</w:t>
       </w:r>
     </w:p>

</xml_diff>

<commit_message>
Polish notebook and update reproducible results
</commit_message>
<xml_diff>
--- a/AI_for_Medicine_Project_Report_Sergio_FINAL_CLEAN.docx
+++ b/AI_for_Medicine_Project_Report_Sergio_FINAL_CLEAN.docx
@@ -1962,12 +1962,7 @@
             <w:vAlign w:val="center"/>
           </w:tcPr>
           <w:p>
-            <w:r/>
             <w:r>
-              <w:rPr>
-                <w:b w:val="0"/>
-                <w:sz w:val="17"/>
-              </w:rPr>
               <w:t>S1 - Routine risk factors</w:t>
             </w:r>
           </w:p>
@@ -1978,12 +1973,7 @@
             <w:vAlign w:val="center"/>
           </w:tcPr>
           <w:p>
-            <w:r/>
             <w:r>
-              <w:rPr>
-                <w:b w:val="0"/>
-                <w:sz w:val="17"/>
-              </w:rPr>
               <w:t>Logistic Regression</w:t>
             </w:r>
           </w:p>
@@ -1994,13 +1984,8 @@
             <w:vAlign w:val="center"/>
           </w:tcPr>
           <w:p>
-            <w:r/>
             <w:r>
-              <w:rPr>
-                <w:b w:val="0"/>
-                <w:sz w:val="17"/>
-              </w:rPr>
-              <w:t>0.659</w:t>
+              <w:t>0.658</w:t>
             </w:r>
           </w:p>
         </w:tc>
@@ -2010,13 +1995,8 @@
             <w:vAlign w:val="center"/>
           </w:tcPr>
           <w:p>
-            <w:r/>
             <w:r>
-              <w:rPr>
-                <w:b w:val="0"/>
-                <w:sz w:val="17"/>
-              </w:rPr>
-              <w:t>0.084</w:t>
+              <w:t>0.076</w:t>
             </w:r>
           </w:p>
         </w:tc>
@@ -2026,12 +2006,7 @@
             <w:vAlign w:val="center"/>
           </w:tcPr>
           <w:p>
-            <w:r/>
             <w:r>
-              <w:rPr>
-                <w:b w:val="0"/>
-                <w:sz w:val="17"/>
-              </w:rPr>
               <w:t>0.616</w:t>
             </w:r>
           </w:p>
@@ -2044,12 +2019,7 @@
             <w:vAlign w:val="center"/>
           </w:tcPr>
           <w:p>
-            <w:r/>
             <w:r>
-              <w:rPr>
-                <w:b w:val="0"/>
-                <w:sz w:val="17"/>
-              </w:rPr>
               <w:t>S1 - Routine risk factors</w:t>
             </w:r>
           </w:p>
@@ -2060,12 +2030,7 @@
             <w:vAlign w:val="center"/>
           </w:tcPr>
           <w:p>
-            <w:r/>
             <w:r>
-              <w:rPr>
-                <w:b w:val="0"/>
-                <w:sz w:val="17"/>
-              </w:rPr>
               <w:t>Random Forest</w:t>
             </w:r>
           </w:p>
@@ -2076,13 +2041,8 @@
             <w:vAlign w:val="center"/>
           </w:tcPr>
           <w:p>
-            <w:r/>
             <w:r>
-              <w:rPr>
-                <w:b w:val="0"/>
-                <w:sz w:val="17"/>
-              </w:rPr>
-              <w:t>0.694</w:t>
+              <w:t>0.692</w:t>
             </w:r>
           </w:p>
         </w:tc>
@@ -2092,12 +2052,7 @@
             <w:vAlign w:val="center"/>
           </w:tcPr>
           <w:p>
-            <w:r/>
             <w:r>
-              <w:rPr>
-                <w:b w:val="0"/>
-                <w:sz w:val="17"/>
-              </w:rPr>
               <w:t>0.061</w:t>
             </w:r>
           </w:p>
@@ -2108,13 +2063,8 @@
             <w:vAlign w:val="center"/>
           </w:tcPr>
           <w:p>
-            <w:r/>
             <w:r>
-              <w:rPr>
-                <w:b w:val="0"/>
-                <w:sz w:val="17"/>
-              </w:rPr>
-              <w:t>0.654</w:t>
+              <w:t>0.652</w:t>
             </w:r>
           </w:p>
         </w:tc>
@@ -2126,12 +2076,7 @@
             <w:vAlign w:val="center"/>
           </w:tcPr>
           <w:p>
-            <w:r/>
             <w:r>
-              <w:rPr>
-                <w:b w:val="0"/>
-                <w:sz w:val="17"/>
-              </w:rPr>
               <w:t>S2 - Symptoms and resting ECG</w:t>
             </w:r>
           </w:p>
@@ -2142,12 +2087,7 @@
             <w:vAlign w:val="center"/>
           </w:tcPr>
           <w:p>
-            <w:r/>
             <w:r>
-              <w:rPr>
-                <w:b w:val="0"/>
-                <w:sz w:val="17"/>
-              </w:rPr>
               <w:t>Logistic Regression</w:t>
             </w:r>
           </w:p>
@@ -2158,13 +2098,8 @@
             <w:vAlign w:val="center"/>
           </w:tcPr>
           <w:p>
-            <w:r/>
             <w:r>
-              <w:rPr>
-                <w:b w:val="0"/>
-                <w:sz w:val="17"/>
-              </w:rPr>
-              <w:t>0.808</w:t>
+              <w:t>0.806</w:t>
             </w:r>
           </w:p>
         </w:tc>
@@ -2174,13 +2109,8 @@
             <w:vAlign w:val="center"/>
           </w:tcPr>
           <w:p>
-            <w:r/>
             <w:r>
-              <w:rPr>
-                <w:b w:val="0"/>
-                <w:sz w:val="17"/>
-              </w:rPr>
-              <w:t>0.062</w:t>
+              <w:t>0.067</w:t>
             </w:r>
           </w:p>
         </w:tc>
@@ -2190,13 +2120,8 @@
             <w:vAlign w:val="center"/>
           </w:tcPr>
           <w:p>
-            <w:r/>
             <w:r>
-              <w:rPr>
-                <w:b w:val="0"/>
-                <w:sz w:val="17"/>
-              </w:rPr>
-              <w:t>0.748</w:t>
+              <w:t>0.745</w:t>
             </w:r>
           </w:p>
         </w:tc>
@@ -2208,12 +2133,7 @@
             <w:vAlign w:val="center"/>
           </w:tcPr>
           <w:p>
-            <w:r/>
             <w:r>
-              <w:rPr>
-                <w:b w:val="0"/>
-                <w:sz w:val="17"/>
-              </w:rPr>
               <w:t>S2 - Symptoms and resting ECG</w:t>
             </w:r>
           </w:p>
@@ -2224,12 +2144,7 @@
             <w:vAlign w:val="center"/>
           </w:tcPr>
           <w:p>
-            <w:r/>
             <w:r>
-              <w:rPr>
-                <w:b w:val="0"/>
-                <w:sz w:val="17"/>
-              </w:rPr>
               <w:t>Random Forest</w:t>
             </w:r>
           </w:p>
@@ -2240,12 +2155,7 @@
             <w:vAlign w:val="center"/>
           </w:tcPr>
           <w:p>
-            <w:r/>
             <w:r>
-              <w:rPr>
-                <w:b w:val="0"/>
-                <w:sz w:val="17"/>
-              </w:rPr>
               <w:t>0.801</w:t>
             </w:r>
           </w:p>
@@ -2256,13 +2166,8 @@
             <w:vAlign w:val="center"/>
           </w:tcPr>
           <w:p>
-            <w:r/>
             <w:r>
-              <w:rPr>
-                <w:b w:val="0"/>
-                <w:sz w:val="17"/>
-              </w:rPr>
-              <w:t>0.057</w:t>
+              <w:t>0.066</w:t>
             </w:r>
           </w:p>
         </w:tc>
@@ -2272,13 +2177,8 @@
             <w:vAlign w:val="center"/>
           </w:tcPr>
           <w:p>
-            <w:r/>
             <w:r>
-              <w:rPr>
-                <w:b w:val="0"/>
-                <w:sz w:val="17"/>
-              </w:rPr>
-              <w:t>0.731</w:t>
+              <w:t>0.732</w:t>
             </w:r>
           </w:p>
         </w:tc>
@@ -2290,12 +2190,7 @@
             <w:vAlign w:val="center"/>
           </w:tcPr>
           <w:p>
-            <w:r/>
             <w:r>
-              <w:rPr>
-                <w:b w:val="0"/>
-                <w:sz w:val="17"/>
-              </w:rPr>
               <w:t>S3 - Exercise stress test</w:t>
             </w:r>
           </w:p>
@@ -2306,12 +2201,7 @@
             <w:vAlign w:val="center"/>
           </w:tcPr>
           <w:p>
-            <w:r/>
             <w:r>
-              <w:rPr>
-                <w:b w:val="0"/>
-                <w:sz w:val="17"/>
-              </w:rPr>
               <w:t>Logistic Regression</w:t>
             </w:r>
           </w:p>
@@ -2322,13 +2212,8 @@
             <w:vAlign w:val="center"/>
           </w:tcPr>
           <w:p>
-            <w:r/>
             <w:r>
-              <w:rPr>
-                <w:b w:val="0"/>
-                <w:sz w:val="17"/>
-              </w:rPr>
-              <w:t>0.854</w:t>
+              <w:t>0.847</w:t>
             </w:r>
           </w:p>
         </w:tc>
@@ -2338,13 +2223,8 @@
             <w:vAlign w:val="center"/>
           </w:tcPr>
           <w:p>
-            <w:r/>
             <w:r>
-              <w:rPr>
-                <w:b w:val="0"/>
-                <w:sz w:val="17"/>
-              </w:rPr>
-              <w:t>0.043</w:t>
+              <w:t>0.051</w:t>
             </w:r>
           </w:p>
         </w:tc>
@@ -2354,13 +2234,8 @@
             <w:vAlign w:val="center"/>
           </w:tcPr>
           <w:p>
-            <w:r/>
             <w:r>
-              <w:rPr>
-                <w:b w:val="0"/>
-                <w:sz w:val="17"/>
-              </w:rPr>
-              <w:t>0.766</w:t>
+              <w:t>0.768</w:t>
             </w:r>
           </w:p>
         </w:tc>
@@ -2372,12 +2247,7 @@
             <w:vAlign w:val="center"/>
           </w:tcPr>
           <w:p>
-            <w:r/>
             <w:r>
-              <w:rPr>
-                <w:b w:val="0"/>
-                <w:sz w:val="17"/>
-              </w:rPr>
               <w:t>S3 - Exercise stress test</w:t>
             </w:r>
           </w:p>
@@ -2388,12 +2258,7 @@
             <w:vAlign w:val="center"/>
           </w:tcPr>
           <w:p>
-            <w:r/>
             <w:r>
-              <w:rPr>
-                <w:b w:val="0"/>
-                <w:sz w:val="17"/>
-              </w:rPr>
               <w:t>Random Forest</w:t>
             </w:r>
           </w:p>
@@ -2404,13 +2269,8 @@
             <w:vAlign w:val="center"/>
           </w:tcPr>
           <w:p>
-            <w:r/>
             <w:r>
-              <w:rPr>
-                <w:b w:val="0"/>
-                <w:sz w:val="17"/>
-              </w:rPr>
-              <w:t>0.853</w:t>
+              <w:t>0.851</w:t>
             </w:r>
           </w:p>
         </w:tc>
@@ -2420,13 +2280,8 @@
             <w:vAlign w:val="center"/>
           </w:tcPr>
           <w:p>
-            <w:r/>
             <w:r>
-              <w:rPr>
-                <w:b w:val="0"/>
-                <w:sz w:val="17"/>
-              </w:rPr>
-              <w:t>0.050</w:t>
+              <w:t>0.054</w:t>
             </w:r>
           </w:p>
         </w:tc>
@@ -2436,13 +2291,8 @@
             <w:vAlign w:val="center"/>
           </w:tcPr>
           <w:p>
-            <w:r/>
             <w:r>
-              <w:rPr>
-                <w:b w:val="0"/>
-                <w:sz w:val="17"/>
-              </w:rPr>
-              <w:t>0.746</w:t>
+              <w:t>0.742</w:t>
             </w:r>
           </w:p>
         </w:tc>
@@ -2454,12 +2304,7 @@
             <w:vAlign w:val="center"/>
           </w:tcPr>
           <w:p>
-            <w:r/>
             <w:r>
-              <w:rPr>
-                <w:b w:val="0"/>
-                <w:sz w:val="17"/>
-              </w:rPr>
               <w:t>S4 - Advanced diagnostic tests</w:t>
             </w:r>
           </w:p>
@@ -2470,12 +2315,7 @@
             <w:vAlign w:val="center"/>
           </w:tcPr>
           <w:p>
-            <w:r/>
             <w:r>
-              <w:rPr>
-                <w:b w:val="0"/>
-                <w:sz w:val="17"/>
-              </w:rPr>
               <w:t>Logistic Regression</w:t>
             </w:r>
           </w:p>
@@ -2486,13 +2326,8 @@
             <w:vAlign w:val="center"/>
           </w:tcPr>
           <w:p>
-            <w:r/>
             <w:r>
-              <w:rPr>
-                <w:b w:val="0"/>
-                <w:sz w:val="17"/>
-              </w:rPr>
-              <w:t>0.894</w:t>
+              <w:t>0.890</w:t>
             </w:r>
           </w:p>
         </w:tc>
@@ -2502,13 +2337,8 @@
             <w:vAlign w:val="center"/>
           </w:tcPr>
           <w:p>
-            <w:r/>
             <w:r>
-              <w:rPr>
-                <w:b w:val="0"/>
-                <w:sz w:val="17"/>
-              </w:rPr>
-              <w:t>0.041</w:t>
+              <w:t>0.048</w:t>
             </w:r>
           </w:p>
         </w:tc>
@@ -2518,12 +2348,7 @@
             <w:vAlign w:val="center"/>
           </w:tcPr>
           <w:p>
-            <w:r/>
             <w:r>
-              <w:rPr>
-                <w:b w:val="0"/>
-                <w:sz w:val="17"/>
-              </w:rPr>
               <w:t>0.821</w:t>
             </w:r>
           </w:p>
@@ -2536,12 +2361,7 @@
             <w:vAlign w:val="center"/>
           </w:tcPr>
           <w:p>
-            <w:r/>
             <w:r>
-              <w:rPr>
-                <w:b w:val="0"/>
-                <w:sz w:val="17"/>
-              </w:rPr>
               <w:t>S4 - Advanced diagnostic tests</w:t>
             </w:r>
           </w:p>
@@ -2552,12 +2372,7 @@
             <w:vAlign w:val="center"/>
           </w:tcPr>
           <w:p>
-            <w:r/>
             <w:r>
-              <w:rPr>
-                <w:b w:val="0"/>
-                <w:sz w:val="17"/>
-              </w:rPr>
               <w:t>Random Forest</w:t>
             </w:r>
           </w:p>
@@ -2568,13 +2383,8 @@
             <w:vAlign w:val="center"/>
           </w:tcPr>
           <w:p>
-            <w:r/>
             <w:r>
-              <w:rPr>
-                <w:b w:val="0"/>
-                <w:sz w:val="17"/>
-              </w:rPr>
-              <w:t>0.891</w:t>
+              <w:t>0.889</w:t>
             </w:r>
           </w:p>
         </w:tc>
@@ -2584,13 +2394,8 @@
             <w:vAlign w:val="center"/>
           </w:tcPr>
           <w:p>
-            <w:r/>
             <w:r>
-              <w:rPr>
-                <w:b w:val="0"/>
-                <w:sz w:val="17"/>
-              </w:rPr>
-              <w:t>0.045</w:t>
+              <w:t>0.052</w:t>
             </w:r>
           </w:p>
         </w:tc>
@@ -2600,13 +2405,8 @@
             <w:vAlign w:val="center"/>
           </w:tcPr>
           <w:p>
-            <w:r/>
             <w:r>
-              <w:rPr>
-                <w:b w:val="0"/>
-                <w:sz w:val="17"/>
-              </w:rPr>
-              <w:t>0.813</w:t>
+              <w:t>0.814</w:t>
             </w:r>
           </w:p>
         </w:tc>

</xml_diff>

<commit_message>
Add confidence intervals and bias discussion
</commit_message>
<xml_diff>
--- a/AI_for_Medicine_Project_Report_Sergio_FINAL_CLEAN.docx
+++ b/AI_for_Medicine_Project_Report_Sergio_FINAL_CLEAN.docx
@@ -1754,10 +1754,7 @@
         <w:spacing w:after="120"/>
       </w:pPr>
       <w:r>
-        <w:rPr>
-          <w:sz w:val="22"/>
-        </w:rPr>
-        <w:t>The third family is L3 leakage: the test set does not represent the distribution of interest or is not independent. In this dataset, each row represents one patient, so the split is performed at patient level. There are no multiple images or slices from the same patient that could appear on both sides of the split. The main remaining limitation is not leakage but external validity: the Cleveland dataset is small, old and from a specific clinical cohort.</w:t>
+        <w:t>The third family is L3 leakage: the test set does not represent the distribution of interest or is not independent. In this dataset, each row represents one patient, so the split is performed at patient level. There are no multiple images or slices from the same patient that could appear on both sides of the split. The main remaining limitation is external validity: the Cleveland dataset is small, old and from a specific clinical cohort. In the terminology of Kapoor and Narayanan, this creates a risk of sampling bias (L3.3), because performance may change under distribution shift in a different hospital or a modern cohort.</w:t>
       </w:r>
     </w:p>
     <w:p>
@@ -1765,10 +1762,7 @@
         <w:spacing w:after="120"/>
       </w:pPr>
       <w:r>
-        <w:rPr>
-          <w:sz w:val="22"/>
-        </w:rPr>
-        <w:t>Finally, nested cross-validation is used inside the development set. The inner loop tunes hyperparameters with GridSearchCV, while the outer loop estimates performance. Thresholds are also inspected using development data, not by optimising the locked test set. The pipeline mainly protects against L1 preprocessing leakage, while L2 and L3 are addressed by clinical feature design, patient-level splitting and cautious interpretation.</w:t>
+        <w:t>Finally, nested cross-validation is used inside the development set. The inner loop tunes hyperparameters with GridSearchCV, while the outer loop estimates performance. Thresholds are inspected using development data, not by optimising the locked test set. For the stage comparison, the selected threshold maximises balanced accuracy on development predictions, using sensitivity as a secondary criterion. The pipeline mainly protects against L1 preprocessing leakage, while L2 and L3 are addressed by clinical feature design, patient-level splitting and cautious interpretation.</w:t>
       </w:r>
     </w:p>
     <w:p>
@@ -2491,10 +2485,7 @@
         <w:jc w:val="both"/>
       </w:pPr>
       <w:r>
-        <w:rPr>
-          <w:sz w:val="22"/>
-        </w:rPr>
-        <w:t>The final test evaluation by stage confirms the clinical interpretation. Stage 1 reaches a ROC-AUC of 0.823 but has low sensitivity, with 12 false negatives. This contrast is important: an apparently acceptable ranking performance can coexist with an unacceptable miss rate, because in a test set of 60 patients, 12 false negatives mean that almost half of the patients with disease are not detected. Stage 2 improves to a ROC-AUC of 0.919 and clearly reduces false negatives. Stage 3 gives a similar ROC-AUC but improves specificity. Stage 4 gives the best final performance, with ROC-AUC 0.955, accuracy 0.900, and balanced accuracy 0.893. However, the gains are not evenly distributed. The large and reliable improvement is the Stage 1 to Stage 2 jump, while the differences between Stages 2, 3 and 4 are small and, given the size of the test set, may partly reflect statistical noise rather than a real clinical difference.</w:t>
+        <w:t>The final test evaluation by stage confirms the clinical interpretation. Stage 1 reaches a ROC-AUC of 0.823, with a 95% bootstrap confidence interval of 0.703-0.920, but has low sensitivity, with 12 false negatives. This contrast is important: an apparently acceptable ranking performance can coexist with an unacceptable miss rate. Stage 2 improves to a ROC-AUC of 0.919 (95% CI: 0.842-0.975) and clearly reduces false negatives. Stage 3 gives a similar ROC-AUC of 0.908 (95% CI: 0.826-0.967), but improves specificity. Stage 4 gives the best final performance, with ROC-AUC 0.955 (95% CI: 0.900-0.993), accuracy 0.900, and balanced accuracy 0.893. However, the confidence intervals overlap, especially between later stages, so small differences should not be overinterpreted.</w:t>
       </w:r>
     </w:p>
     <w:tbl>
@@ -2557,14 +2548,8 @@
             <w:shd w:fill="1F4E79"/>
           </w:tcPr>
           <w:p>
-            <w:r/>
             <w:r>
-              <w:rPr>
-                <w:b/>
-                <w:color w:val="FFFFFF"/>
-                <w:sz w:val="17"/>
-              </w:rPr>
-              <w:t>ROC-AUC</w:t>
+              <w:t>ROC-AUC (95% CI)</w:t>
             </w:r>
           </w:p>
         </w:tc>
@@ -2680,13 +2665,8 @@
             <w:vAlign w:val="center"/>
           </w:tcPr>
           <w:p>
-            <w:r/>
             <w:r>
-              <w:rPr>
-                <w:b w:val="0"/>
-                <w:sz w:val="17"/>
-              </w:rPr>
-              <w:t>0.823</w:t>
+              <w:t>0.823 (0.703-0.920)</w:t>
             </w:r>
           </w:p>
         </w:tc>
@@ -2794,13 +2774,8 @@
             <w:vAlign w:val="center"/>
           </w:tcPr>
           <w:p>
-            <w:r/>
             <w:r>
-              <w:rPr>
-                <w:b w:val="0"/>
-                <w:sz w:val="17"/>
-              </w:rPr>
-              <w:t>0.919</w:t>
+              <w:t>0.919 (0.842-0.975)</w:t>
             </w:r>
           </w:p>
         </w:tc>
@@ -2908,13 +2883,8 @@
             <w:vAlign w:val="center"/>
           </w:tcPr>
           <w:p>
-            <w:r/>
             <w:r>
-              <w:rPr>
-                <w:b w:val="0"/>
-                <w:sz w:val="17"/>
-              </w:rPr>
-              <w:t>0.908</w:t>
+              <w:t>0.908 (0.826-0.967)</w:t>
             </w:r>
           </w:p>
         </w:tc>
@@ -3022,13 +2992,8 @@
             <w:vAlign w:val="center"/>
           </w:tcPr>
           <w:p>
-            <w:r/>
             <w:r>
-              <w:rPr>
-                <w:b w:val="0"/>
-                <w:sz w:val="17"/>
-              </w:rPr>
-              <w:t>0.955</w:t>
+              <w:t>0.955 (0.900-0.993)</w:t>
             </w:r>
           </w:p>
         </w:tc>
@@ -3221,10 +3186,7 @@
         <w:jc w:val="both"/>
       </w:pPr>
       <w:r>
-        <w:rPr>
-          <w:sz w:val="22"/>
-        </w:rPr>
-        <w:t>The threshold analysis shows that the default value of 0.5 should not be accepted automatically. In a screening-like early stage, a lower threshold could be clinically reasonable if the objective is to reduce false negatives. In later stages, when more specific information is available, a stricter threshold may be acceptable to improve specificity and precision. In this project, thresholds are analysed as a methodological and clinical trade-off, not as a real clinical recommendation.</w:t>
+        <w:t>The threshold analysis shows that the default value of 0.5 should not be accepted automatically. In the final stage comparison, thresholds were selected only from development predictions: 0.5 for Stage 1, 0.5 for Stage 2, 0.6 for Stage 3, and 0.5 for Stage 4. This avoids using the locked test set to choose the operating point. In a screening-like early stage, a lower threshold could be clinically reasonable if the objective is to reduce false negatives. In later stages, when more specific information is available, a stricter threshold may be acceptable to improve specificity and precision. In this project, thresholds are analysed as a methodological and clinical trade-off, not as a real clinical recommendation.</w:t>
       </w:r>
     </w:p>
     <w:p>
@@ -3438,10 +3400,7 @@
         <w:jc w:val="both"/>
       </w:pPr>
       <w:r>
-        <w:rPr>
-          <w:sz w:val="22"/>
-        </w:rPr>
-        <w:t>There are important limitations. The dataset is small and old, and it comes from a specific clinical context. The final test set contains only 60 patients, so small changes can affect the metrics. There is no external validation on another hospital or a modern cohort. Also, the project does not perform a cost-effectiveness analysis, so it cannot claim that the workflow saves money. It can only suggest that earlier prediction may help use diagnostic resources more efficiently.</w:t>
+        <w:t>There are important limitations. The dataset is small and old, and it comes from a specific clinical context. This is a sampling bias risk (L3.3): the test set may not represent the distribution of patients in another hospital, country, or modern clinical protocol. Therefore, distribution shift is a real concern and external validation would be necessary before any clinical use. The final test set contains only 60 patients, so small changes can affect the metrics. Also, the project does not perform a cost-effectiveness analysis, so it cannot claim that the workflow saves money. It can only suggest that earlier prediction may help use diagnostic resources more efficiently.</w:t>
       </w:r>
     </w:p>
     <w:p>
@@ -3459,10 +3418,7 @@
         <w:jc w:val="both"/>
       </w:pPr>
       <w:r>
-        <w:rPr>
-          <w:sz w:val="22"/>
-        </w:rPr>
-        <w:t>This project shows that heart disease prediction can be studied as a staged clinical workflow rather than a single table-based classification problem. The first conclusion concerns clinical usefulness. Routine risk factors alone (Stage 1) are not sufficient: although Stage 1 reaches a ROC-AUC of 0.823, it misses many patients, with 12 false negatives on the final test set, which would be unacceptable for early detection. The largest and most consistent improvement appears when symptoms and resting ECG are added (Stage 2, ROC-AUC 0.919), using information that is fast, low-cost, and widely available. A Stage 2 model could therefore act as an early triage layer that prioritises which patients should continue to more specialised testing.</w:t>
+        <w:t>This project shows that heart disease prediction can be studied as a staged clinical workflow rather than a single table-based classification problem. The first conclusion concerns clinical usefulness. Routine risk factors alone (Stage 1) are not sufficient: although Stage 1 reaches a ROC-AUC of 0.823, its confidence interval is wide and it misses many patients, with 12 false negatives on the final test set. The largest practical improvement appears when symptoms and resting ECG are added (Stage 2, ROC-AUC 0.919), using information that is fast, low-cost, and widely available. A Stage 2 model could therefore act as an early triage layer that prioritises which patients should continue to more specialised testing.</w:t>
       </w:r>
     </w:p>
     <w:p>
@@ -3471,10 +3427,7 @@
         <w:jc w:val="both"/>
       </w:pPr>
       <w:r>
-        <w:rPr>
-          <w:sz w:val="22"/>
-        </w:rPr>
-        <w:t>The second conclusion concerns whether all the data are really needed. The incremental gain from Stage 2 to Stage 4 is small in ranking terms (ROC-AUC 0.919 to 0.955), even though Stage 4 gives the best final classification and the single most influential feature, ca, belongs to it. This points to a clinically meaningful distinction: advanced and resource-intensive tests are most valuable for confident final diagnosis, but they may not be necessary to obtain a useful early risk estimate. In other words, every variable is required for the task of confirmation, but not necessarily for the task of prioritisation.</w:t>
+        <w:t>The second conclusion concerns whether all the data are really needed. The incremental gain from Stage 2 to Stage 4 is small in ranking terms (ROC-AUC 0.919 to 0.955), even though Stage 4 gives the best final classification and the single most influential feature, ca, belongs to it. Because the 95% confidence intervals overlap, this difference should be interpreted cautiously. Advanced and resource-intensive tests are most valuable for confident final diagnosis, but they may not be necessary to obtain a useful early risk estimate.</w:t>
       </w:r>
     </w:p>
     <w:p>
@@ -3483,10 +3436,7 @@
         <w:jc w:val="both"/>
       </w:pPr>
       <w:r>
-        <w:rPr>
-          <w:sz w:val="22"/>
-        </w:rPr>
-        <w:t>The third conclusion concerns the significance of the differences. With only 60 patients in the locked test set, the small differences between later stages must be interpreted with caution: the Stage 1 to Stage 2 jump is large enough to be considered clinically relevant, but the differences among Stages 2, 3 and 4 fall within a range where statistical noise cannot be excluded. Taken together, the practical message is not simply that Stage 4 performs best, but that a staged model can support risk stratification, where earlier and cheaper information may already be enough to decide who needs closer follow-up, while advanced testing is reserved for confirmation.</w:t>
+        <w:t>The third conclusion concerns the significance of the differences. With only 60 patients in the locked test set, the confidence intervals are wide. The Stage 1 to Stage 2 jump is the most clinically meaningful change, but the differences among Stages 2, 3 and 4 fall within a range where statistical noise cannot be excluded. Taken together, the practical message is not simply that Stage 4 performs best, but that a staged model can support risk stratification, where earlier and cheaper information may already be enough to decide who needs closer follow-up, while advanced testing is reserved for confirmation.</w:t>
       </w:r>
     </w:p>
     <w:p>
@@ -3495,10 +3445,7 @@
         <w:jc w:val="both"/>
       </w:pPr>
       <w:r>
-        <w:rPr>
-          <w:sz w:val="22"/>
-        </w:rPr>
-        <w:t>The clearest limitation of this project is the small sample size. The dataset contains only 297 patients, and the locked test set contains 60 patients. For this reason, small differences between later stages should not be overinterpreted.</w:t>
+        <w:t>The clearest limitation of this project is the small sample size. The dataset contains only 297 patients, and the locked test set contains 60 patients. For this reason, bootstrap confidence intervals are reported for ROC-AUC, and small differences between later stages should not be overinterpreted.</w:t>
       </w:r>
     </w:p>
     <w:p>
@@ -3506,10 +3453,7 @@
         <w:spacing w:after="120"/>
       </w:pPr>
       <w:r>
-        <w:rPr>
-          <w:sz w:val="22"/>
-        </w:rPr>
-        <w:t>Future work should first develop a cost-sensitive threshold analysis. In early stages, the model could prioritise sensitivity to reduce false negatives and identify patients who may need further assessment. In later stages, when more specific diagnostic information is available, the threshold could be adjusted to prioritise specificity or precision. This would make the staged workflow more clinically meaningful, because the best threshold depends on the clinical objective and on the cost of each type of error.</w:t>
+        <w:t>Future work should first develop a cost-sensitive threshold analysis. In early stages, the model could prioritise sensitivity to reduce false negatives and identify patients who may need further assessment. In later stages, when more specific diagnostic information is available, the threshold could be adjusted to prioritise specificity or precision. A second related direction is calibration analysis. The Brier score improved from Stage 1 to Stage 4 in this project, but a real triage tool would require a more complete calibration study to check whether predicted probabilities correspond to realistic clinical risks.</w:t>
       </w:r>
     </w:p>
     <w:p>
@@ -3561,10 +3505,7 @@
         <w:jc w:val="both"/>
       </w:pPr>
       <w:r>
-        <w:rPr>
-          <w:sz w:val="22"/>
-        </w:rPr>
-        <w:t>Even with public data, medical machine learning has ethical risks. A model trained on a small and old dataset may not generalise to other populations, hospitals, or clinical protocols. If used without external validation, it could produce misleading predictions. For this reason, the limitations are clearly reported.</w:t>
+        <w:t>Even with public data, medical machine learning has ethical risks. A model trained on a small and old dataset may not generalise to other populations, hospitals, or clinical protocols. This is not only a generic limitation, but a sampling bias and distribution shift problem. If used without external validation, it could produce misleading predictions. For this reason, the limitations are clearly reported.</w:t>
       </w:r>
     </w:p>
     <w:p>
@@ -3606,10 +3547,7 @@
         <w:jc w:val="both"/>
       </w:pPr>
       <w:r>
-        <w:rPr>
-          <w:sz w:val="22"/>
-        </w:rPr>
-        <w:t>Reproducibility is supported by a fixed random seed, a stratified locked test split, scikit-learn Pipeline objects, GridSearchCV, nested cross-validation, and saved outputs. The notebook can be opened from GitHub in Google Colab using the Colab badge in the README and at the top of the notebook.</w:t>
+        <w:t>Reproducibility is supported by a fixed random seed, a stratified locked test split, scikit-learn Pipeline objects, GridSearchCV, nested cross-validation, pinned package versions, saved outputs, and bootstrap confidence intervals. The notebook can be opened from GitHub in Google Colab using the Colab badge at the top of the notebook.</w:t>
       </w:r>
     </w:p>
     <w:p>

</xml_diff>